<commit_message>
Scrub all proprietary company names, client details, and template text to generic language
</commit_message>
<xml_diff>
--- a/scso_rfq_tool/resources/SCSO RFQ.docx
+++ b/scso_rfq_tool/resources/SCSO RFQ.docx
@@ -16,38 +16,10 @@
         </w:rPr>
       </w:pPr>
       <w:r>
-        <w:rPr>
-          <w:rFonts w:ascii="Cambria" w:hAnsi="Cambria"/>
-          <w:b/>
-          <w:bCs/>
-          <w:color w:val="595959" w:themeColor="text1" w:themeTint="A6"/>
-          <w:sz w:val="24"/>
-          <w:szCs w:val="24"/>
-        </w:rPr>
         <w:t>Quotation Request:</w:t>
-      </w:r>
-      <w:r>
-        <w:rPr>
-          <w:rFonts w:ascii="Cambria" w:hAnsi="Cambria"/>
-          <w:b/>
-          <w:bCs/>
-          <w:color w:val="595959" w:themeColor="text1" w:themeTint="A6"/>
-          <w:sz w:val="24"/>
-          <w:szCs w:val="24"/>
-        </w:rPr>
         <w:tab/>
-      </w:r>
-      <w:r>
-        <w:rPr>
-          <w:rFonts w:ascii="Cambria" w:hAnsi="Cambria"/>
-          <w:b/>
-          <w:bCs/>
-          <w:color w:val="595959" w:themeColor="text1" w:themeTint="A6"/>
-          <w:sz w:val="24"/>
-          <w:szCs w:val="24"/>
-        </w:rPr>
         <w:tab/>
-        <w:t>Ref. # SCSO</w:t>
+        <w:t>Ref. # 0000</w:t>
       </w:r>
     </w:p>
     <w:p>
@@ -160,13 +132,7 @@
         </w:rPr>
       </w:pPr>
       <w:r>
-        <w:rPr>
-          <w:rFonts w:ascii="Cambria" w:hAnsi="Cambria" w:cs="Calibri"/>
-          <w:color w:val="auto"/>
-          <w:sz w:val="22"/>
-          <w:szCs w:val="22"/>
-        </w:rPr>
-        <w:t>You are kindly requested to quote your best offer with prices for the below inquiry issued by one of our customers in Iraq.</w:t>
+        <w:t>You are kindly requested to quote your best offer with prices for the below inquiry issued by one of our clients.</w:t>
       </w:r>
     </w:p>
     <w:p>
@@ -449,25 +415,8 @@
         </w:rPr>
       </w:pPr>
       <w:r>
-        <w:rPr>
-          <w:rFonts w:ascii="Cambria" w:hAnsi="Cambria" w:cs="Calibri"/>
-          <w:color w:val="auto"/>
-          <w:sz w:val="22"/>
-          <w:szCs w:val="22"/>
-        </w:rPr>
-        <w:t xml:space="preserve">Closing Date: </w:t>
-      </w:r>
-      <w:proofErr w:type="gramStart"/>
-      <w:r>
-        <w:rPr>
-          <w:rFonts w:ascii="Cambria" w:hAnsi="Cambria" w:cs="Calibri"/>
-          <w:color w:val="auto"/>
-          <w:sz w:val="22"/>
-          <w:szCs w:val="22"/>
-        </w:rPr>
-        <w:t>2025.XX.XX.</w:t>
-      </w:r>
-      <w:proofErr w:type="gramEnd"/>
+        <w:t>Closing Date: YYYY.MM.DD</w:t>
+      </w:r>
     </w:p>
     <w:p>
       <w:pPr>
@@ -1467,14 +1416,7 @@
         </w:rPr>
       </w:pPr>
       <w:r>
-        <w:rPr>
-          <w:rFonts w:ascii="Cambria" w:hAnsi="Cambria" w:cs="Calibri"/>
-          <w:color w:val="auto"/>
-          <w:sz w:val="22"/>
-          <w:szCs w:val="22"/>
-          <w:lang w:val="en-GB"/>
-        </w:rPr>
-        <w:t>Provide Certificate of origin legalized by Iraqi embassy at country of origin at time of order.</w:t>
+        <w:t>Provide Certificate of origin legalized by embassy at country of origin at time of order.</w:t>
       </w:r>
     </w:p>
     <w:p>

</xml_diff>